<commit_message>
docs: remove redundant experiment heading prefixes
</commit_message>
<xml_diff>
--- a/reports/物流模型CPT与SFT实验汇总_20260915.docx
+++ b/reports/物流模型CPT与SFT实验汇总_20260915.docx
@@ -3565,7 +3565,7 @@
           <w:rFonts w:ascii="黑体" w:hAnsi="黑体" w:eastAsia="黑体" w:cs="黑体"/>
           <w:color w:val="000000"/>
         </w:rPr>
-        <w:t>1. 实验1：单本物流教材首遍训练</w:t>
+        <w:t>实验1：单本物流教材首遍训练</w:t>
       </w:r>
     </w:p>
     <w:p>
@@ -4059,7 +4059,7 @@
           <w:rFonts w:ascii="黑体" w:hAnsi="黑体" w:eastAsia="黑体" w:cs="黑体"/>
           <w:color w:val="000000"/>
         </w:rPr>
-        <w:t>1. 实验2：单书两遍和四遍曝光曲线</w:t>
+        <w:t>实验2：单书两遍和四遍曝光曲线</w:t>
       </w:r>
     </w:p>
     <w:p>
@@ -4730,7 +4730,7 @@
           <w:rFonts w:ascii="黑体" w:hAnsi="黑体" w:eastAsia="黑体" w:cs="黑体"/>
           <w:color w:val="000000"/>
         </w:rPr>
-        <w:t>1. 实验3：评测原题直接转文本训练</w:t>
+        <w:t>实验3：评测原题直接转文本训练</w:t>
       </w:r>
     </w:p>
     <w:p>
@@ -5239,7 +5239,7 @@
           <w:rFonts w:ascii="黑体" w:hAnsi="黑体" w:eastAsia="黑体" w:cs="黑体"/>
           <w:color w:val="000000"/>
         </w:rPr>
-        <w:t>1. 实验4：评测题干改写后转文本训练</w:t>
+        <w:t>实验4：评测题干改写后转文本训练</w:t>
       </w:r>
     </w:p>
     <w:p>
@@ -5748,7 +5748,7 @@
           <w:rFonts w:ascii="黑体" w:hAnsi="黑体" w:eastAsia="黑体" w:cs="黑体"/>
           <w:color w:val="000000"/>
         </w:rPr>
-        <w:t>1. 实验5：八题全文监督拟合</w:t>
+        <w:t>实验5：八题全文监督拟合</w:t>
       </w:r>
     </w:p>
     <w:p>
@@ -6257,7 +6257,7 @@
           <w:rFonts w:ascii="黑体" w:hAnsi="黑体" w:eastAsia="黑体" w:cs="黑体"/>
           <w:color w:val="000000"/>
         </w:rPr>
-        <w:t>1. 实验6：八题答案专属监督拟合</w:t>
+        <w:t>实验6：八题答案专属监督拟合</w:t>
       </w:r>
     </w:p>
     <w:p>
@@ -6766,7 +6766,7 @@
           <w:rFonts w:ascii="黑体" w:hAnsi="黑体" w:eastAsia="黑体" w:cs="黑体"/>
           <w:color w:val="000000"/>
         </w:rPr>
-        <w:t>1. 实验7：全部评测题对话式同题拟合</w:t>
+        <w:t>实验7：全部评测题对话式同题拟合</w:t>
       </w:r>
     </w:p>
     <w:p>
@@ -7452,7 +7452,7 @@
           <w:rFonts w:ascii="黑体" w:hAnsi="黑体" w:eastAsia="黑体" w:cs="黑体"/>
           <w:color w:val="000000"/>
         </w:rPr>
-        <w:t>1. 实验8：教材两千条问答生产后的训练</w:t>
+        <w:t>实验8：教材两千条问答生产后的训练</w:t>
       </w:r>
     </w:p>
     <w:p>
@@ -7961,7 +7961,7 @@
           <w:rFonts w:ascii="黑体" w:hAnsi="黑体" w:eastAsia="黑体" w:cs="黑体"/>
           <w:color w:val="000000"/>
         </w:rPr>
-        <w:t>1. 实验9：三百五十五条能力型最小答案训练</w:t>
+        <w:t>实验9：三百五十五条能力型最小答案训练</w:t>
       </w:r>
     </w:p>
     <w:p>
@@ -8470,7 +8470,7 @@
           <w:rFonts w:ascii="黑体" w:hAnsi="黑体" w:eastAsia="黑体" w:cs="黑体"/>
           <w:color w:val="000000"/>
         </w:rPr>
-        <w:t>1. 实验10：教材知识单元驱动的任务型训练</w:t>
+        <w:t>实验10：教材知识单元驱动的任务型训练</w:t>
       </w:r>
     </w:p>
     <w:p>
@@ -8979,7 +8979,7 @@
           <w:rFonts w:ascii="黑体" w:hAnsi="黑体" w:eastAsia="黑体" w:cs="黑体"/>
           <w:color w:val="000000"/>
         </w:rPr>
-        <w:t>1. 实验11：原教材八遍完整曝光曲线</w:t>
+        <w:t>实验11：原教材八遍完整曝光曲线</w:t>
       </w:r>
     </w:p>
     <w:p>
@@ -10201,7 +10201,7 @@
           <w:rFonts w:ascii="黑体" w:hAnsi="黑体" w:eastAsia="黑体" w:cs="黑体"/>
           <w:color w:val="000000"/>
         </w:rPr>
-        <w:t>1. 实验12：原分块与跨章节关联分块对照</w:t>
+        <w:t>实验12：原分块与跨章节关联分块对照</w:t>
       </w:r>
     </w:p>
     <w:p>
@@ -10857,7 +10857,7 @@
           <w:rFonts w:ascii="黑体" w:hAnsi="黑体" w:eastAsia="黑体" w:cs="黑体"/>
           <w:color w:val="000000"/>
         </w:rPr>
-        <w:t>1. 实验13：ERPNext流程种子语料训练</w:t>
+        <w:t>实验13：ERPNext流程种子语料训练</w:t>
       </w:r>
     </w:p>
     <w:p>
@@ -11351,7 +11351,7 @@
           <w:rFonts w:ascii="黑体" w:hAnsi="黑体" w:eastAsia="黑体" w:cs="黑体"/>
           <w:color w:val="000000"/>
         </w:rPr>
-        <w:t>1. 实验14：新增物流材料的首批训练</w:t>
+        <w:t>实验14：新增物流材料的首批训练</w:t>
       </w:r>
     </w:p>
     <w:p>
@@ -11845,7 +11845,7 @@
           <w:rFonts w:ascii="黑体" w:hAnsi="黑体" w:eastAsia="黑体" w:cs="黑体"/>
           <w:color w:val="000000"/>
         </w:rPr>
-        <w:t>1. 实验15：全部十三份物流材料训练</w:t>
+        <w:t>实验15：全部十三份物流材料训练</w:t>
       </w:r>
     </w:p>
     <w:p>
@@ -12339,7 +12339,7 @@
           <w:rFonts w:ascii="黑体" w:hAnsi="黑体" w:eastAsia="黑体" w:cs="黑体"/>
           <w:color w:val="000000"/>
         </w:rPr>
-        <w:t>1. 实验16：十三份材料加错题相关知识补充</w:t>
+        <w:t>实验16：十三份材料加错题相关知识补充</w:t>
       </w:r>
     </w:p>
     <w:p>
@@ -12833,7 +12833,7 @@
           <w:rFonts w:ascii="黑体" w:hAnsi="黑体" w:eastAsia="黑体" w:cs="黑体"/>
           <w:color w:val="000000"/>
         </w:rPr>
-        <w:t>1. 实验17：直接Step120任务型训练 S2</w:t>
+        <w:t>实验17：直接Step120任务型训练 S2</w:t>
       </w:r>
     </w:p>
     <w:p>
@@ -13327,7 +13327,7 @@
           <w:rFonts w:ascii="黑体" w:hAnsi="黑体" w:eastAsia="黑体" w:cs="黑体"/>
           <w:color w:val="000000"/>
         </w:rPr>
-        <w:t>1. 实验18：直接Step120低学习率对照 S1</w:t>
+        <w:t>实验18：直接Step120低学习率对照 S1</w:t>
       </w:r>
     </w:p>
     <w:p>
@@ -13821,7 +13821,7 @@
           <w:rFonts w:ascii="黑体" w:hAnsi="黑体" w:eastAsia="黑体" w:cs="黑体"/>
           <w:color w:val="000000"/>
         </w:rPr>
-        <w:t>1. 实验19：来源条件与数值变体训练 S3</w:t>
+        <w:t>实验19：来源条件与数值变体训练 S3</w:t>
       </w:r>
     </w:p>
     <w:p>
@@ -14315,7 +14315,7 @@
           <w:rFonts w:ascii="黑体" w:hAnsi="黑体" w:eastAsia="黑体" w:cs="黑体"/>
           <w:color w:val="000000"/>
         </w:rPr>
-        <w:t>1. 实验20：完整知识语料的LoRA训练</w:t>
+        <w:t>实验20：完整知识语料的LoRA训练</w:t>
       </w:r>
     </w:p>
     <w:p>
@@ -14809,7 +14809,7 @@
           <w:rFonts w:ascii="黑体" w:hAnsi="黑体" w:eastAsia="黑体" w:cs="黑体"/>
           <w:color w:val="000000"/>
         </w:rPr>
-        <w:t>1. 实验21：仓储条件与计算任务训练 S4</w:t>
+        <w:t>实验21：仓储条件与计算任务训练 S4</w:t>
       </w:r>
     </w:p>
     <w:p>
@@ -15303,7 +15303,7 @@
           <w:rFonts w:ascii="黑体" w:hAnsi="黑体" w:eastAsia="黑体" w:cs="黑体"/>
           <w:color w:val="000000"/>
         </w:rPr>
-        <w:t>1. 实验22：竞争规则与边界覆盖训练 S5</w:t>
+        <w:t>实验22：竞争规则与边界覆盖训练 S5</w:t>
       </w:r>
     </w:p>
     <w:p>

</xml_diff>